<commit_message>
cambiar colores y tamaño imagenes presentación
</commit_message>
<xml_diff>
--- a/Presentación/PRESENTACIÓN FINAL – HUDSON BREW ANALYTICS Narrativo.docx
+++ b/Presentación/PRESENTACIÓN FINAL – HUDSON BREW ANALYTICS Narrativo.docx
@@ -250,10 +250,7 @@
     </w:p>
     <w:p>
       <w:r>
-        <w:t>Además,</w:t>
-      </w:r>
-      <w:r>
-        <w:t xml:space="preserve"> utilizamos técnicas de análisis avanzado para detectar patrones de comportamiento difíciles de identificar a simple vista.</w:t>
+        <w:t>Además, utilizamos técnicas de análisis avanzado para detectar patrones de comportamiento difíciles de identificar a simple vista.</w:t>
       </w:r>
     </w:p>
     <w:p/>
@@ -478,10 +475,7 @@
     </w:p>
     <w:p>
       <w:r>
-        <w:t>Además,</w:t>
-      </w:r>
-      <w:r>
-        <w:t xml:space="preserve"> identificamos dos productos especialmente relevantes:</w:t>
+        <w:t>Además, identificamos dos productos especialmente relevantes:</w:t>
       </w:r>
     </w:p>
     <w:p>
@@ -697,13 +691,8 @@
           <w:numId w:val="5"/>
         </w:numPr>
       </w:pPr>
-      <w:proofErr w:type="gramStart"/>
-      <w:r>
-        <w:t>Ticket</w:t>
-      </w:r>
-      <w:proofErr w:type="gramEnd"/>
-      <w:r>
-        <w:t xml:space="preserve"> medio</w:t>
+      <w:r>
+        <w:t>Ticket medio</w:t>
       </w:r>
     </w:p>
     <w:p>
@@ -949,13 +938,7 @@
       </w:r>
       <w:proofErr w:type="spellEnd"/>
       <w:r>
-        <w:t xml:space="preserve"> Kitchen para replicarlas en el resto de </w:t>
-      </w:r>
-      <w:r>
-        <w:t>los establecimientos</w:t>
-      </w:r>
-      <w:r>
-        <w:t>.</w:t>
+        <w:t xml:space="preserve"> Kitchen para replicarlas en el resto de los establecimientos.</w:t>
       </w:r>
     </w:p>
     <w:p>
@@ -1159,6 +1142,12 @@
       </w:r>
     </w:p>
     <w:p>
+      <w:r>
+        <w:lastRenderedPageBreak/>
+        <w:t>Conclusión de la propuesta de trabajo</w:t>
+      </w:r>
+    </w:p>
+    <w:p>
       <w:pPr>
         <w:rPr>
           <w:b/>
@@ -1166,7 +1155,6 @@
         </w:rPr>
       </w:pPr>
       <w:r>
-        <w:lastRenderedPageBreak/>
         <w:t>Muchas Gracias.</w:t>
       </w:r>
     </w:p>
@@ -3272,6 +3260,7 @@
   <w:style w:type="character" w:default="1" w:styleId="Fuentedeprrafopredeter">
     <w:name w:val="Default Paragraph Font"/>
     <w:uiPriority w:val="1"/>
+    <w:semiHidden/>
     <w:unhideWhenUsed/>
   </w:style>
   <w:style w:type="table" w:default="1" w:styleId="Tablanormal">

</xml_diff>